<commit_message>
Bind focused package verification and validate the settled methylation draft
</commit_message>
<xml_diff>
--- a/research/autonomy/continuation-2026-10-02/methylation-publication/outgoing/online-resource-1.docx
+++ b/research/autonomy/continuation-2026-10-02/methylation-publication/outgoing/online-resource-1.docx
@@ -101,7 +101,7 @@
           <w:rFonts w:ascii="Courier New" w:hAnsi="Courier New"/>
           <w:sz w:val="18"/>
         </w:rPr>
-        <w:t>no\s+RNA</w:t>
+        <w:t>\bno\s+RNA\b</w:t>
       </w:r>
       <w:r>
         <w:t xml:space="preserve">, </w:t>
@@ -131,7 +131,7 @@
           <w:rFonts w:ascii="Courier New" w:hAnsi="Courier New"/>
           <w:sz w:val="18"/>
         </w:rPr>
-        <w:t>no\s+fusion</w:t>
+        <w:t>\bno\s+fusion\b</w:t>
       </w:r>
       <w:r>
         <w:t>; these are literal text heuristics, not semantic adjudication. Notes matching a pattern are excluded; absent mappings and conflicting class mappings are excluded. The exact original implementation and all 428 inclusion/exclusion rows are preserved. The resulting 120-profile, 12-class subset is fixed for this report, but the inspected history does not establish freezing before prediction inspection. The annotations were author reported and not independently blinded diagnostic adjudication.</w:t>

</xml_diff>